<commit_message>
more changes to the draft
</commit_message>
<xml_diff>
--- a/inflation_relative_price_variance.docx
+++ b/inflation_relative_price_variance.docx
@@ -384,6 +384,251 @@
       <w:r>
         <w:t xml:space="preserve">Data and methodology</w:t>
       </w:r>
+    </w:p>
+    <w:p>
+      <w:pPr>
+        <w:pStyle w:val="FirstParagraph"/>
+      </w:pPr>
+      <m:oMathPara>
+        <m:oMathParaPr>
+          <m:jc m:val="center"/>
+        </m:oMathParaPr>
+        <m:oMath>
+          <m:r>
+            <m:t>R</m:t>
+          </m:r>
+          <m:r>
+            <m:t>P</m:t>
+          </m:r>
+          <m:sSub>
+            <m:e>
+              <m:r>
+                <m:t>V</m:t>
+              </m:r>
+            </m:e>
+            <m:sub>
+              <m:r>
+                <m:t>i</m:t>
+              </m:r>
+              <m:r>
+                <m:rPr>
+                  <m:sty m:val="p"/>
+                </m:rPr>
+                <m:t>,</m:t>
+              </m:r>
+              <m:r>
+                <m:t>t</m:t>
+              </m:r>
+            </m:sub>
+          </m:sSub>
+          <m:r>
+            <m:rPr>
+              <m:sty m:val="p"/>
+            </m:rPr>
+            <m:t>=</m:t>
+          </m:r>
+          <m:r>
+            <m:rPr>
+              <m:sty m:val="p"/>
+            </m:rPr>
+            <m:t>∑</m:t>
+          </m:r>
+          <m:sSub>
+            <m:e>
+              <m:r>
+                <m:t>ω</m:t>
+              </m:r>
+            </m:e>
+            <m:sub>
+              <m:r>
+                <m:t>j</m:t>
+              </m:r>
+            </m:sub>
+          </m:sSub>
+          <m:sSup>
+            <m:e>
+              <m:d>
+                <m:dPr>
+                  <m:begChr m:val="("/>
+                  <m:endChr m:val=")"/>
+                  <m:sepChr m:val=""/>
+                  <m:grow/>
+                </m:dPr>
+                <m:e>
+                  <m:sSub>
+                    <m:e>
+                      <m:r>
+                        <m:t>π</m:t>
+                      </m:r>
+                    </m:e>
+                    <m:sub>
+                      <m:r>
+                        <m:t>i</m:t>
+                      </m:r>
+                      <m:r>
+                        <m:rPr>
+                          <m:sty m:val="p"/>
+                        </m:rPr>
+                        <m:t>,</m:t>
+                      </m:r>
+                      <m:r>
+                        <m:t>t</m:t>
+                      </m:r>
+                    </m:sub>
+                  </m:sSub>
+                  <m:r>
+                    <m:rPr>
+                      <m:sty m:val="p"/>
+                    </m:rPr>
+                    <m:t>−</m:t>
+                  </m:r>
+                  <m:sSub>
+                    <m:e>
+                      <m:r>
+                        <m:t>π</m:t>
+                      </m:r>
+                    </m:e>
+                    <m:sub>
+                      <m:r>
+                        <m:t>t</m:t>
+                      </m:r>
+                    </m:sub>
+                  </m:sSub>
+                </m:e>
+              </m:d>
+            </m:e>
+            <m:sup>
+              <m:r>
+                <m:t>2</m:t>
+              </m:r>
+            </m:sup>
+          </m:sSup>
+          <m:r>
+            <m:rPr>
+              <m:sty m:val="p"/>
+            </m:rPr>
+            <m:t>,</m:t>
+          </m:r>
+        </m:oMath>
+      </m:oMathPara>
+    </w:p>
+    <w:p>
+      <w:pPr>
+        <w:pStyle w:val="FirstParagraph"/>
+      </w:pPr>
+      <w:r>
+        <w:t xml:space="preserve">where (</w:t>
+      </w:r>
+      <w:r>
+        <w:t xml:space="preserve"> </w:t>
+      </w:r>
+      <w:r>
+        <w:rPr>
+          <w:iCs/>
+          <w:i/>
+        </w:rPr>
+        <w:t xml:space="preserve">{j} ) is the expenditure share of good ( j ), (</w:t>
+      </w:r>
+      <w:r>
+        <w:rPr>
+          <w:iCs/>
+          <w:i/>
+        </w:rPr>
+        <w:t xml:space="preserve"> </w:t>
+      </w:r>
+      <w:r>
+        <w:t xml:space="preserve">{i,t} ) is the inflation rate of good ( j ) at time ( t ) and (</w:t>
+      </w:r>
+      <w:r>
+        <w:t xml:space="preserve"> </w:t>
+      </w:r>
+      <w:r>
+        <w:t xml:space="preserve">_{t} ) is the aggregate inflation rate at time ( t ).</w:t>
+      </w:r>
+    </w:p>
+    <w:p>
+      <w:pPr>
+        <w:pStyle w:val="BodyText"/>
+      </w:pPr>
+      <m:oMathPara>
+        <m:oMathParaPr>
+          <m:jc m:val="center"/>
+        </m:oMathParaPr>
+        <m:oMath>
+          <m:r>
+            <m:t>R</m:t>
+          </m:r>
+          <m:r>
+            <m:t>P</m:t>
+          </m:r>
+          <m:sSub>
+            <m:e>
+              <m:r>
+                <m:t>V</m:t>
+              </m:r>
+            </m:e>
+            <m:sub>
+              <m:r>
+                <m:t>i</m:t>
+              </m:r>
+              <m:r>
+                <m:rPr>
+                  <m:sty m:val="p"/>
+                </m:rPr>
+                <m:t>,</m:t>
+              </m:r>
+              <m:r>
+                <m:t>t</m:t>
+              </m:r>
+            </m:sub>
+          </m:sSub>
+          <m:r>
+            <m:rPr>
+              <m:sty m:val="p"/>
+            </m:rPr>
+            <m:t>=</m:t>
+          </m:r>
+          <m:sSub>
+            <m:e>
+              <m:r>
+                <m:t>α</m:t>
+              </m:r>
+            </m:e>
+            <m:sub>
+              <m:r>
+                <m:t>i</m:t>
+              </m:r>
+            </m:sub>
+          </m:sSub>
+          <m:r>
+            <m:rPr>
+              <m:sty m:val="p"/>
+            </m:rPr>
+            <m:t>+</m:t>
+          </m:r>
+          <m:sSub>
+            <m:e>
+              <m:r>
+                <m:t>μ</m:t>
+              </m:r>
+            </m:e>
+            <m:sub>
+              <m:r>
+                <m:t>i</m:t>
+              </m:r>
+              <m:r>
+                <m:rPr>
+                  <m:sty m:val="p"/>
+                </m:rPr>
+                <m:t>,</m:t>
+              </m:r>
+              <m:r>
+                <m:t>t</m:t>
+              </m:r>
+            </m:sub>
+          </m:sSub>
+        </m:oMath>
+      </m:oMathPara>
     </w:p>
     <w:bookmarkEnd w:id="23"/>
     <w:bookmarkStart w:id="28" w:name="results"/>

</xml_diff>